<commit_message>
SD: corrected assessment brief (three approved LOs), three objectives per week, plus this week's teaching pages (from screen-design-2026-27 0628f94)
Co-Authored-By: Claude Opus 5 <noreply@anthropic.com>
</commit_message>
<xml_diff>
--- a/modules/sd/Screen_Design_Assessment_Brief_CAF_2026-27.docx
+++ b/modules/sd/Screen_Design_Assessment_Brief_CAF_2026-27.docx
@@ -454,14 +454,6 @@
             <w:r>
               <w:t xml:space="preserve">Friday 8 January 2027, 21:00</w:t>
             </w:r>
-            <w:proofErr w:type="spellStart"/>
-            <w:r>
-              <w:t/>
-            </w:r>
-            <w:proofErr w:type="spellEnd"/>
-            <w:r>
-              <w:t xml:space="preserve"/>
-            </w:r>
           </w:p>
         </w:tc>
       </w:tr>
@@ -791,7 +783,7 @@
               <w:spacing w:before="40" w:after="40"/>
             </w:pPr>
             <w:r>
-              <w:t>Apply core design principles to produce responsive, visually coherent screen layouts.</w:t>
+              <w:t>Apply fundamental design principles to produce visually engaging layouts.</w:t>
             </w:r>
           </w:p>
         </w:tc>
@@ -854,86 +846,7 @@
               <w:spacing w:before="40" w:after="40"/>
             </w:pPr>
             <w:r>
-              <w:t>Create user-</w:t>
-            </w:r>
-            <w:proofErr w:type="spellStart"/>
-            <w:r>
-              <w:t>centred</w:t>
-            </w:r>
-            <w:proofErr w:type="spellEnd"/>
-            <w:r>
-              <w:t xml:space="preserve"> design solutions using effective typography, layout, and </w:t>
-            </w:r>
-            <w:proofErr w:type="spellStart"/>
-            <w:r>
-              <w:t>colour</w:t>
-            </w:r>
-            <w:proofErr w:type="spellEnd"/>
-            <w:r>
-              <w:t>, with consideration for accessibility and inclusive design.</w:t>
-            </w:r>
-          </w:p>
-        </w:tc>
-      </w:tr>
-      <w:tr>
-        <w:tblPrEx>
-          <w:tblCellMar>
-            <w:top w:w="0" w:type="dxa"/>
-            <w:bottom w:w="0" w:type="dxa"/>
-          </w:tblCellMar>
-        </w:tblPrEx>
-        <w:tc>
-          <w:tcPr>
-            <w:tcW w:w="3200" w:type="dxa"/>
-            <w:tcBorders>
-              <w:top w:val="single" w:sz="4" w:space="0" w:color="CCCCCC"/>
-              <w:left w:val="single" w:sz="4" w:space="0" w:color="CCCCCC"/>
-              <w:bottom w:val="single" w:sz="4" w:space="0" w:color="CCCCCC"/>
-              <w:right w:val="single" w:sz="4" w:space="0" w:color="CCCCCC"/>
-            </w:tcBorders>
-            <w:shd w:val="clear" w:color="auto" w:fill="D9E8F5"/>
-            <w:tcMar>
-              <w:top w:w="100" w:type="dxa"/>
-              <w:left w:w="140" w:type="dxa"/>
-              <w:bottom w:w="100" w:type="dxa"/>
-              <w:right w:w="100" w:type="dxa"/>
-            </w:tcMar>
-          </w:tcPr>
-          <w:p>
-            <w:r>
-              <w:rPr>
-                <w:b/>
-                <w:bCs/>
-                <w:sz w:val="20"/>
-                <w:szCs w:val="20"/>
-              </w:rPr>
-              <w:t>LO4 (B3)</w:t>
-            </w:r>
-          </w:p>
-        </w:tc>
-        <w:tc>
-          <w:tcPr>
-            <w:tcW w:w="7235" w:type="dxa"/>
-            <w:tcBorders>
-              <w:top w:val="single" w:sz="4" w:space="0" w:color="CCCCCC"/>
-              <w:left w:val="single" w:sz="4" w:space="0" w:color="CCCCCC"/>
-              <w:bottom w:val="single" w:sz="4" w:space="0" w:color="CCCCCC"/>
-              <w:right w:val="single" w:sz="4" w:space="0" w:color="CCCCCC"/>
-            </w:tcBorders>
-            <w:shd w:val="clear" w:color="auto" w:fill="FFFFFF"/>
-            <w:tcMar>
-              <w:top w:w="100" w:type="dxa"/>
-              <w:left w:w="140" w:type="dxa"/>
-              <w:bottom w:w="100" w:type="dxa"/>
-              <w:right w:w="100" w:type="dxa"/>
-            </w:tcMar>
-          </w:tcPr>
-          <w:p>
-            <w:pPr>
-              <w:spacing w:before="40" w:after="40"/>
-            </w:pPr>
-            <w:r>
-              <w:t>Reflect on and justify design decisions with reference to user needs, accessibility, sustainability, and visual communication principles.</w:t>
+              <w:t xml:space="preserve">Create user-centered design solutions, incorporating effective typography and colour theory.</w:t>
             </w:r>
           </w:p>
         </w:tc>
@@ -1165,12 +1078,6 @@
                 <w:szCs w:val="20"/>
               </w:rPr>
               <w:t xml:space="preserve">The open theme structure allows students to engage with topics from any cultural, geographic, or community context. Assessment criteria reward design thinking and </w:t>
-            </w:r>
-            <w:r>
-              <w:rPr>
-                <w:sz w:val="20"/>
-                <w:szCs w:val="20"/>
-              </w:rPr>
               <w:lastRenderedPageBreak/>
               <w:t>process rather than prescribing specific visual styles or cultural references. The accessibility requirement (see LO3) ensures the work is inclusive by design. Marking panels will apply the RIPIAG principles to ensure equitable assessment.</w:t>
             </w:r>
@@ -1303,23 +1210,7 @@
                 <w:sz w:val="20"/>
                 <w:szCs w:val="20"/>
               </w:rPr>
-              <w:t xml:space="preserve">The reflective rationale must include a minimum of one paragraph addressing the environmental or social dimensions of the design. Students are encouraged to consider: data </w:t>
-            </w:r>
-            <w:proofErr w:type="spellStart"/>
-            <w:r>
-              <w:rPr>
-                <w:sz w:val="20"/>
-                <w:szCs w:val="20"/>
-              </w:rPr>
-              <w:t>minimisation</w:t>
-            </w:r>
-            <w:proofErr w:type="spellEnd"/>
-            <w:r>
-              <w:rPr>
-                <w:sz w:val="20"/>
-                <w:szCs w:val="20"/>
-              </w:rPr>
-              <w:t xml:space="preserve"> in UX, avoidance of manipulative dark patterns, carbon footprint of digital services, and responsible use of imagery and resources. This connects to MMU's Road to 2030 sustainability commitments.</w:t>
+              <w:t xml:space="preserve">The reflective rationale must include a minimum of one paragraph addressing the environmental or social dimensions of the design. Students are encouraged to consider: data minimisation in UX, avoidance of manipulative dark patterns, carbon footprint of digital services, and responsible use of imagery and resources. This connects to MMU's Road to 2030 sustainability commitments.</w:t>
             </w:r>
           </w:p>
         </w:tc>
@@ -1349,7 +1240,6 @@
             </w:tcMar>
           </w:tcPr>
           <w:p>
-            <w:proofErr w:type="spellStart"/>
             <w:r>
               <w:rPr>
                 <w:b/>
@@ -1360,7 +1250,6 @@
               </w:rPr>
               <w:t>Internationalisation</w:t>
             </w:r>
-            <w:proofErr w:type="spellEnd"/>
           </w:p>
         </w:tc>
         <w:tc>
@@ -1386,39 +1275,7 @@
                 <w:sz w:val="20"/>
                 <w:szCs w:val="20"/>
               </w:rPr>
-              <w:t xml:space="preserve">Students may choose a theme from any cultural or geographic context. The reflective rationale should demonstrate awareness of at least one cross-cultural communication consideration relevant to their design (e.g. </w:t>
-            </w:r>
-            <w:proofErr w:type="spellStart"/>
-            <w:r>
-              <w:rPr>
-                <w:sz w:val="20"/>
-                <w:szCs w:val="20"/>
-              </w:rPr>
-              <w:t>colour</w:t>
-            </w:r>
-            <w:proofErr w:type="spellEnd"/>
-            <w:r>
-              <w:rPr>
-                <w:sz w:val="20"/>
-                <w:szCs w:val="20"/>
-              </w:rPr>
-              <w:t xml:space="preserve"> symbolism, reading direction, icon universality, or cultural specificity of imagery). This connects to MMU's Enabling Strategy for </w:t>
-            </w:r>
-            <w:proofErr w:type="spellStart"/>
-            <w:r>
-              <w:rPr>
-                <w:sz w:val="20"/>
-                <w:szCs w:val="20"/>
-              </w:rPr>
-              <w:t>Internationalisation</w:t>
-            </w:r>
-            <w:proofErr w:type="spellEnd"/>
-            <w:r>
-              <w:rPr>
-                <w:sz w:val="20"/>
-                <w:szCs w:val="20"/>
-              </w:rPr>
-              <w:t>.</w:t>
+              <w:t xml:space="preserve">Students may choose a theme from any cultural or geographic context. The reflective rationale should demonstrate awareness of at least one cross-cultural communication consideration relevant to their design (e.g. colour symbolism, reading direction, icon universality, or cultural specificity of imagery). This connects to MMU's Enabling Strategy for Internationalisation.</w:t>
             </w:r>
           </w:p>
         </w:tc>
@@ -1486,41 +1343,7 @@
           <w:iCs/>
           <w:color w:val="555555"/>
         </w:rPr>
-        <w:t xml:space="preserve"> (mobile, tablet, and/or desktop variants) demonstrating responsive design principles — built in Figma, Adobe XD,</w:t>
-      </w:r>
-      <w:r>
-        <w:rPr>
-          <w:i/>
-          <w:iCs/>
-          <w:color w:val="555555"/>
-        </w:rPr>
-        <w:t xml:space="preserve"> </w:t>
-      </w:r>
-      <w:proofErr w:type="spellStart"/>
-      <w:r>
-        <w:rPr>
-          <w:i/>
-          <w:iCs/>
-          <w:color w:val="555555"/>
-        </w:rPr>
-        <w:t>Powerpoint</w:t>
-      </w:r>
-      <w:proofErr w:type="spellEnd"/>
-      <w:r>
-        <w:rPr>
-          <w:i/>
-          <w:iCs/>
-          <w:color w:val="555555"/>
-        </w:rPr>
-        <w:t>/Clickable PDF</w:t>
-      </w:r>
-      <w:r>
-        <w:rPr>
-          <w:i/>
-          <w:iCs/>
-          <w:color w:val="555555"/>
-        </w:rPr>
-        <w:t xml:space="preserve"> or equivalent.</w:t>
+        <w:t xml:space="preserve"> (mobile, tablet, and/or desktop variants) demonstrating responsive design principles — built in Figma, Adobe XD, Powerpoint/Clickable PDF or equivalent.</w:t>
       </w:r>
     </w:p>
     <w:p>
@@ -1545,23 +1368,7 @@
           <w:iCs/>
           <w:color w:val="555555"/>
         </w:rPr>
-        <w:t xml:space="preserve"> — </w:t>
-      </w:r>
-      <w:r>
-        <w:rPr>
-          <w:i/>
-          <w:iCs/>
-          <w:color w:val="555555"/>
-        </w:rPr>
-        <w:t xml:space="preserve">such as </w:t>
-      </w:r>
-      <w:r>
-        <w:rPr>
-          <w:i/>
-          <w:iCs/>
-          <w:color w:val="555555"/>
-        </w:rPr>
-        <w:t>concept sketches, wireframes, mood board, and style tiles demonstrating your design process.</w:t>
+        <w:t xml:space="preserve"> — such as concept sketches, wireframes, mood board, and style tiles demonstrating your design process.</w:t>
       </w:r>
     </w:p>
     <w:p>
@@ -1586,61 +1393,7 @@
           <w:iCs/>
           <w:color w:val="555555"/>
         </w:rPr>
-        <w:t xml:space="preserve"> — a written discussion of your design decisions covering: layout, typography, </w:t>
-      </w:r>
-      <w:proofErr w:type="spellStart"/>
-      <w:r>
-        <w:rPr>
-          <w:i/>
-          <w:iCs/>
-          <w:color w:val="555555"/>
-        </w:rPr>
-        <w:t>colour</w:t>
-      </w:r>
-      <w:proofErr w:type="spellEnd"/>
-      <w:r>
-        <w:rPr>
-          <w:i/>
-          <w:iCs/>
-          <w:color w:val="555555"/>
-        </w:rPr>
-        <w:t>, user-</w:t>
-      </w:r>
-      <w:proofErr w:type="spellStart"/>
-      <w:r>
-        <w:rPr>
-          <w:i/>
-          <w:iCs/>
-          <w:color w:val="555555"/>
-        </w:rPr>
-        <w:t>centred</w:t>
-      </w:r>
-      <w:proofErr w:type="spellEnd"/>
-      <w:r>
-        <w:rPr>
-          <w:i/>
-          <w:iCs/>
-          <w:color w:val="555555"/>
-        </w:rPr>
-        <w:t xml:space="preserve"> thinking, accessibility, AI use (if applicable), and at least one ESD or </w:t>
-      </w:r>
-      <w:proofErr w:type="spellStart"/>
-      <w:r>
-        <w:rPr>
-          <w:i/>
-          <w:iCs/>
-          <w:color w:val="555555"/>
-        </w:rPr>
-        <w:t>internationalisation</w:t>
-      </w:r>
-      <w:proofErr w:type="spellEnd"/>
-      <w:r>
-        <w:rPr>
-          <w:i/>
-          <w:iCs/>
-          <w:color w:val="555555"/>
-        </w:rPr>
-        <w:t xml:space="preserve"> consideration.</w:t>
+        <w:t xml:space="preserve"> — a written discussion of your design decisions covering: layout, typography, colour, user-centred thinking, accessibility, AI use (if applicable), and at least one ESD or internationalisation consideration.</w:t>
       </w:r>
     </w:p>
     <w:p>
@@ -1890,25 +1643,7 @@
               <w:spacing w:before="40" w:after="40"/>
             </w:pPr>
             <w:r>
-              <w:t xml:space="preserve">Single PDF document. </w:t>
-            </w:r>
-            <w:r>
-              <w:t>If students use p</w:t>
-            </w:r>
-            <w:r>
-              <w:t xml:space="preserve">rototype links (Figma/XD) </w:t>
-            </w:r>
-            <w:r>
-              <w:t xml:space="preserve">these </w:t>
-            </w:r>
-            <w:r>
-              <w:t xml:space="preserve">must be clearly labelled and accessible. </w:t>
-            </w:r>
-            <w:r>
-              <w:t xml:space="preserve">If the prototype is self-contained in the submission PDF, it needs to be clickable. </w:t>
-            </w:r>
-            <w:r>
-              <w:t>All visual artefacts should be embedded or securely hyperlinked.</w:t>
+              <w:t xml:space="preserve">Single PDF document. If students use prototype links (Figma/XD) these must be clearly labelled and accessible. If the prototype is self-contained in the submission PDF, it needs to be clickable. All visual artefacts should be embedded or securely hyperlinked.</w:t>
             </w:r>
           </w:p>
         </w:tc>
@@ -2615,29 +2350,7 @@
                 <w:sz w:val="18"/>
                 <w:szCs w:val="18"/>
               </w:rPr>
-              <w:t xml:space="preserve">Applies design principles (layout, typography, </w:t>
-            </w:r>
-            <w:proofErr w:type="spellStart"/>
-            <w:r>
-              <w:rPr>
-                <w:i/>
-                <w:iCs/>
-                <w:color w:val="444444"/>
-                <w:sz w:val="18"/>
-                <w:szCs w:val="18"/>
-              </w:rPr>
-              <w:t>colour</w:t>
-            </w:r>
-            <w:proofErr w:type="spellEnd"/>
-            <w:r>
-              <w:rPr>
-                <w:i/>
-                <w:iCs/>
-                <w:color w:val="444444"/>
-                <w:sz w:val="18"/>
-                <w:szCs w:val="18"/>
-              </w:rPr>
-              <w:t>, hierarchy) to create clear, purposeful screen-based communication.</w:t>
+              <w:t xml:space="preserve">Applies design principles (layout, typography, colour, hierarchy) to create clear, purposeful screen-based communication.</w:t>
             </w:r>
           </w:p>
         </w:tc>
@@ -2664,23 +2377,7 @@
                 <w:sz w:val="18"/>
                 <w:szCs w:val="18"/>
               </w:rPr>
-              <w:t xml:space="preserve">Design choices are absent or arbitrary. No evidence of intentional application of layout, typography, or </w:t>
-            </w:r>
-            <w:proofErr w:type="spellStart"/>
-            <w:r>
-              <w:rPr>
-                <w:sz w:val="18"/>
-                <w:szCs w:val="18"/>
-              </w:rPr>
-              <w:t>colour</w:t>
-            </w:r>
-            <w:proofErr w:type="spellEnd"/>
-            <w:r>
-              <w:rPr>
-                <w:sz w:val="18"/>
-                <w:szCs w:val="18"/>
-              </w:rPr>
-              <w:t>.</w:t>
+              <w:t xml:space="preserve">Design choices are absent or arbitrary. No evidence of intentional application of layout, typography, or colour.</w:t>
             </w:r>
           </w:p>
         </w:tc>
@@ -2761,23 +2458,7 @@
                 <w:sz w:val="18"/>
                 <w:szCs w:val="18"/>
               </w:rPr>
-              <w:t xml:space="preserve">Design principles applied confidently and purposefully. Strong visual coherence; typography and </w:t>
-            </w:r>
-            <w:proofErr w:type="spellStart"/>
-            <w:r>
-              <w:rPr>
-                <w:sz w:val="18"/>
-                <w:szCs w:val="18"/>
-              </w:rPr>
-              <w:t>colour</w:t>
-            </w:r>
-            <w:proofErr w:type="spellEnd"/>
-            <w:r>
-              <w:rPr>
-                <w:sz w:val="18"/>
-                <w:szCs w:val="18"/>
-              </w:rPr>
-              <w:t xml:space="preserve"> reinforce communication intent.</w:t>
+              <w:t xml:space="preserve">Design principles applied confidently and purposefully. Strong visual coherence; typography and colour reinforce communication intent.</w:t>
             </w:r>
           </w:p>
         </w:tc>
@@ -2841,27 +2522,7 @@
                 <w:sz w:val="19"/>
                 <w:szCs w:val="19"/>
               </w:rPr>
-              <w:t>2. User-</w:t>
-            </w:r>
-            <w:proofErr w:type="spellStart"/>
-            <w:r>
-              <w:rPr>
-                <w:b/>
-                <w:bCs/>
-                <w:sz w:val="19"/>
-                <w:szCs w:val="19"/>
-              </w:rPr>
-              <w:t>Centred</w:t>
-            </w:r>
-            <w:proofErr w:type="spellEnd"/>
-            <w:r>
-              <w:rPr>
-                <w:b/>
-                <w:bCs/>
-                <w:sz w:val="19"/>
-                <w:szCs w:val="19"/>
-              </w:rPr>
-              <w:t xml:space="preserve"> Thinking</w:t>
+              <w:t xml:space="preserve">2. User-Centred Thinking</w:t>
             </w:r>
           </w:p>
           <w:p>
@@ -2903,23 +2564,7 @@
                 <w:sz w:val="18"/>
                 <w:szCs w:val="18"/>
               </w:rPr>
-              <w:t>No evidence of user-</w:t>
-            </w:r>
-            <w:proofErr w:type="spellStart"/>
-            <w:r>
-              <w:rPr>
-                <w:sz w:val="18"/>
-                <w:szCs w:val="18"/>
-              </w:rPr>
-              <w:t>centred</w:t>
-            </w:r>
-            <w:proofErr w:type="spellEnd"/>
-            <w:r>
-              <w:rPr>
-                <w:sz w:val="18"/>
-                <w:szCs w:val="18"/>
-              </w:rPr>
-              <w:t xml:space="preserve"> consideration. Accessibility or usability not addressed.</w:t>
+              <w:t xml:space="preserve">No evidence of user-centred consideration. Accessibility or usability not addressed.</w:t>
             </w:r>
           </w:p>
         </w:tc>
@@ -3000,23 +2645,7 @@
                 <w:sz w:val="18"/>
                 <w:szCs w:val="18"/>
               </w:rPr>
-              <w:t>Strong user-</w:t>
-            </w:r>
-            <w:proofErr w:type="spellStart"/>
-            <w:r>
-              <w:rPr>
-                <w:sz w:val="18"/>
-                <w:szCs w:val="18"/>
-              </w:rPr>
-              <w:t>centred</w:t>
-            </w:r>
-            <w:proofErr w:type="spellEnd"/>
-            <w:r>
-              <w:rPr>
-                <w:sz w:val="18"/>
-                <w:szCs w:val="18"/>
-              </w:rPr>
-              <w:t xml:space="preserve"> rationale. Accessibility, inclusivity, and usability are well integrated throughout the prototype.</w:t>
+              <w:t xml:space="preserve">Strong user-centred rationale. Accessibility, inclusivity, and usability are well integrated throughout the prototype.</w:t>
             </w:r>
           </w:p>
         </w:tc>
@@ -3043,23 +2672,7 @@
                 <w:sz w:val="18"/>
                 <w:szCs w:val="18"/>
               </w:rPr>
-              <w:t>Exceptional user-</w:t>
-            </w:r>
-            <w:proofErr w:type="spellStart"/>
-            <w:r>
-              <w:rPr>
-                <w:sz w:val="18"/>
-                <w:szCs w:val="18"/>
-              </w:rPr>
-              <w:t>centred</w:t>
-            </w:r>
-            <w:proofErr w:type="spellEnd"/>
-            <w:r>
-              <w:rPr>
-                <w:sz w:val="18"/>
-                <w:szCs w:val="18"/>
-              </w:rPr>
-              <w:t xml:space="preserve"> approach. Prototype demonstrates sophisticated awareness of diverse user needs, inclusive design, and cross-cultural considerations.</w:t>
+              <w:t xml:space="preserve">Exceptional user-centred approach. Prototype demonstrates sophisticated awareness of diverse user needs, inclusive design, and cross-cultural considerations.</w:t>
             </w:r>
           </w:p>
         </w:tc>

</xml_diff>